<commit_message>
added DOCX rewrite pipeline
</commit_message>
<xml_diff>
--- a/backend/output.docx
+++ b/backend/output.docx
@@ -761,10 +761,10 @@
         <w:rPr>
           <w:color w:val="1F1F1F"/>
         </w:rPr>
-        <w:t>The advent of the digital era has revolutionized financial transactions, shifting them from traditional cash-based payments to fully digitized transactions. A cashless economy, characterized by the complete digitization of financial exchanges, aims to replace physical cash with electronic transactions.</w:t>
-      </w:r>
-      <w:r>
-        <w:t/>
+        <w:t xml:space="preserve">In the digital era, financial transactions have undergone a significant transformation, shifting from traditional cash-based payments to fully digitized transactions. The concept of 100% digitized money transactions aims to create a cashless economy where all financial exchanges, from everyday purchases to large-scale business dealings, are conducted electronically. This transition is driven by advancements in digital banking, mobile payment platforms, blockchain technology, and government initiatives promoting financial inclusion. </w:t>
+      </w:r>
+      <w:r>
+        <w:t xml:space="preserve"/>
       </w:r>
     </w:p>
     <w:p>
@@ -776,10 +776,10 @@
         <w:rPr>
           <w:color w:val="1F1F1F"/>
         </w:rPr>
-        <w:t>The transition is driven by advancements in digital banking, mobile payment platforms, blockchain technology, and government initiatives promoting financial inclusion.</w:t>
-      </w:r>
-      <w:r>
-        <w:t/>
+        <w:t xml:space="preserve">The benefits of digitized transactions include enhanced security, transparency, speed, and convenience. By eliminating cash handling, digital transactions reduce risks associated with theft, counterfeiting, and corruption. Additionally, digital payment systems provide an efficient and cost-effective method for businesses and individuals to manage their finances. However, achieving 100% digitization requires overcoming challenges such as cybersecurity threats, infrastructure limitations, and ensuring accessibility for all socioeconomic groups. </w:t>
+      </w:r>
+      <w:r>
+        <w:t xml:space="preserve"/>
       </w:r>
     </w:p>
     <w:p>
@@ -791,10 +791,10 @@
         <w:rPr>
           <w:color w:val="1F1F1F"/>
         </w:rPr>
-        <w:t>The benefits of digitized transactions include enhanced security, increased transparency, speed, and convenience. Digital transactions eliminate the risks associated with theft, counterfeiting, and corruption, while providing an efficient and cost-effective method for businesses and individuals to manage their finances.</w:t>
-      </w:r>
-      <w:r>
-        <w:t/>
+        <w:t xml:space="preserve">This report explores the key aspects of digitized money transactions, including technological enablers, security considerations, global trends, and challenges in implementation. It also examines the impact on businesses, consumers, and financial institutions, highlighting the necessary steps to achieve a seamless and fully digital financial ecosystem. </w:t>
+      </w:r>
+      <w:r>
+        <w:t xml:space="preserve"/>
       </w:r>
     </w:p>
     <w:p>
@@ -827,7 +827,7 @@
         <w:ind w:left="0" w:right="287"/>
       </w:pPr>
       <w:r>
-        <w:t>However, the path to achieving 100% digitization is fraught with challenges, including cybersecurity threats, infrastructure limitations, and ensuring accessibility for all socioeconomic groups.</w:t>
+        <w:t xml:space="preserve">Digital transactions eliminate the need for physical cash handling, allowing instant and seamless payments. With online banking, mobile wallets, and UPI systems, individuals and businesses can conduct transactions anytime, anywhere, without relying on cash  </w:t>
       </w:r>
     </w:p>
     <w:p>
@@ -836,16 +836,16 @@
         <w:ind w:left="0" w:right="287"/>
       </w:pPr>
       <w:r>
-        <w:t>This report delves into the key aspects of digitized money transactions, including technological enablers, security considerations, global trends, and implementation challenges. It also examines the impact on businesses, consumers, and financial institutions, highlighting the necessary steps to achieve a seamless and fully digital financial ecosystem.</w:t>
+        <w:t>availability.</w:t>
       </w:r>
       <w:r>
         <w:rPr>
           <w:sz w:val="14"/>
         </w:rPr>
-        <w:t/>
-      </w:r>
-      <w:r>
-        <w:t/>
+        <w:t xml:space="preserve"/>
+      </w:r>
+      <w:r>
+        <w:t xml:space="preserve"/>
       </w:r>
     </w:p>
     <w:p>
@@ -879,7 +879,7 @@
         <w:ind w:left="0" w:right="287"/>
       </w:pPr>
       <w:r>
-        <w:t>Digital transactions eliminate the need for physical cash handling, allowing instant and seamless payments via online banking, mobile wallets, and UPI systems. This enables individuals and businesses to conduct transactions anytime, anywhere, independent of cash availability.</w:t>
+        <w:t xml:space="preserve">Electronic transactions create an automatic record, ensuring transparency and traceability. This helps governments and financial institutions track money flow, reducing illegal activities such as money laundering, tax evasion, and corruption.  </w:t>
       </w:r>
     </w:p>
     <w:p>
@@ -942,16 +942,16 @@
         <w:ind w:left="0" w:right="287"/>
       </w:pPr>
       <w:r>
-        <w:t>Electronic transactions create an automatic record, ensuring transparency and traceability. This helps governments and financial institutions track money flow, reducing illegal activities such as money laundering, tax evasion, and corruption.</w:t>
+        <w:t>A fully digitized financial system enables people from remote and rural areas to access banking services via mobile phones and internet-based platforms. This inclusion empowers small businesses, farmers, and daily wage earners to participate in the formal economy without needing physical bank branches.</w:t>
       </w:r>
       <w:r>
         <w:rPr>
           <w:sz w:val="14"/>
         </w:rPr>
-        <w:t/>
-      </w:r>
-      <w:r>
-        <w:t/>
+        <w:t xml:space="preserve"/>
+      </w:r>
+      <w:r>
+        <w:t xml:space="preserve"/>
       </w:r>
     </w:p>
     <w:p>
@@ -985,16 +985,16 @@
         <w:ind w:left="0" w:right="287"/>
       </w:pPr>
       <w:r>
-        <w:t>A fully digitized financial system facilitates access to banking services for remote and rural areas through mobile phones and internet-based platforms. This inclusion empowers small businesses, farmers, and daily wage earners to participate in the formal economy without needing physical bank branches.</w:t>
+        <w:t>Handling cash involves operational costs like printing currency, managing ATMs, and security expenses. Digital transactions lower these costs for banks, businesses, and consumers, leading to more efficient financial services.</w:t>
       </w:r>
       <w:r>
         <w:rPr>
           <w:sz w:val="14"/>
         </w:rPr>
-        <w:t/>
-      </w:r>
-      <w:r>
-        <w:t/>
+        <w:t xml:space="preserve"/>
+      </w:r>
+      <w:r>
+        <w:t xml:space="preserve"/>
       </w:r>
     </w:p>
     <w:p>
@@ -1038,23 +1038,23 @@
         <w:ind w:left="0" w:right="287"/>
       </w:pPr>
       <w:r>
-        <w:t>Cash handling involves operational costs such as printing currency, managing ATMs, and security expenses. Digital transactions lower these costs for banks, businesses, and consumers, leading to more efficient financial services.</w:t>
-      </w:r>
-      <w:r>
-        <w:rPr>
-          <w:b/>
-        </w:rPr>
-        <w:t/>
+        <w:t>A cashless economy accelerates economic growth by reducing transaction costs, improving tax collection, and increasing revenue for businesses. Governments can also implement better financial policies based on real-time transaction data, improving overall economic planning</w:t>
+      </w:r>
+      <w:r>
+        <w:rPr>
+          <w:b/>
+        </w:rPr>
+        <w:t>.</w:t>
       </w:r>
       <w:r>
         <w:rPr>
           <w:b/>
           <w:sz w:val="12"/>
         </w:rPr>
-        <w:t/>
-      </w:r>
-      <w:r>
-        <w:t/>
+        <w:t xml:space="preserve"/>
+      </w:r>
+      <w:r>
+        <w:t xml:space="preserve"/>
       </w:r>
     </w:p>
     <w:p>
@@ -1089,16 +1089,16 @@
         <w:ind w:left="0" w:right="287"/>
       </w:pPr>
       <w:r>
-        <w:t>A cashless economy accelerates economic growth by reducing transaction costs, improving tax collection, and increasing revenue for businesses. Governments can also implement better financial policies based on real-time transaction data, improving overall economic planning.</w:t>
+        <w:t>Digital payment systems facilitate smooth cross-border trade, e-commerce, and international transactions. Technologies like blockchain and fintech innovations provide secure and instant global money transfers without high transaction fees.</w:t>
       </w:r>
       <w:r>
         <w:rPr>
           <w:sz w:val="14"/>
         </w:rPr>
-        <w:t/>
-      </w:r>
-      <w:r>
-        <w:t/>
+        <w:t xml:space="preserve"/>
+      </w:r>
+      <w:r>
+        <w:t xml:space="preserve"/>
       </w:r>
     </w:p>
     <w:p>
@@ -1133,7 +1133,7 @@
         <w:ind w:left="0" w:right="287"/>
       </w:pPr>
       <w:r>
-        <w:t>Digital payment systems facilitate smooth cross-border trade, e-commerce, and international transactions. Technologies like blockchain and fintech innovations provide secure and instant global money transfers without high transaction fees.</w:t>
+        <w:t xml:space="preserve">Digital transactions help governments efficiently distribute subsidies, pensions, and welfare benefits directly to beneficiaries, eliminating middlemen and ensuring funds reach the intended recipients without leakage  </w:t>
       </w:r>
     </w:p>
     <w:p>
@@ -1203,7 +1203,7 @@
         <w:ind w:left="0" w:right="287"/>
       </w:pPr>
       <w:r>
-        <w:t>Digital transactions help governments efficiently distribute subsidies, pensions, and welfare benefits directly to beneficiaries, eliminating middlemen and ensuring funds reach the intended recipients without leakage.</w:t>
+        <w:t xml:space="preserve">In Figure 2.1 feedback collected from participants highlights their growing awareness of the benefits and significance of a fully digitized financial system. Many expressed a deeper understanding of how digital transactions enhance security, convenience, and economic efficiency. Participants also showed enthusiasm for adopting cashless payment methods in their daily lives and businesses. Their suggestions emphasized the need for more awareness programs, hands-on workshops, and real-world case studies to further improve digital literacy and ensure a smooth transition to a fully digital economy.  </w:t>
       </w:r>
     </w:p>
     <w:p>
@@ -1518,7 +1518,7 @@
         <w:ind w:left="0" w:right="287"/>
       </w:pPr>
       <w:r>
-        <w:t>Participants' feedback highlights their growing awareness of the benefits and significance of a fully digitized financial system. Many expressed a deeper understanding of how digital transactions enhance security, convenience, and economic efficiency, and enthusiasm for adopting cashless payment methods in their daily lives and businesses.</w:t>
+        <w:t xml:space="preserve">Facilitating digitized money transactions is a transformative step toward a more efficient, secure, and transparent financial ecosystem. By eliminating cash dependence, digital transactions enhance financial accessibility, reduce corruption, and promote economic growth. They also contribute to a more inclusive society by enabling seamless participation in the economy for individuals and businesses, regardless of their location.  </w:t>
       </w:r>
     </w:p>
     <w:p>
@@ -1526,7 +1526,7 @@
         <w:ind w:left="0" w:right="287"/>
       </w:pPr>
       <w:r>
-        <w:t>Facilitating digitized money transactions is a transformative step toward a more efficient, secure, and transparent financial ecosystem. By eliminating cash dependence, digital transactions enhance financial accessibility, reduce corruption, and promote economic growth, contributing to a more inclusive society.</w:t>
+        <w:t xml:space="preserve">However, achieving a fully digitized financial system requires addressing key challenges such as cybersecurity threats, infrastructure development, and digital literacy. Governments, financial institutions, and technology providers must work together to ensure secure, reliable, and user-friendly digital payment systems. Additionally, policies that encourage widespread adoption, especially in rural and underprivileged areas, are essential for a smooth transition.  </w:t>
       </w:r>
     </w:p>
     <w:p>
@@ -1534,7 +1534,7 @@
         <w:ind w:left="0" w:right="287"/>
       </w:pPr>
       <w:r>
-        <w:t>Achieving a fully digitized financial system requires addressing key challenges such as cybersecurity threats, infrastructure development, and digital literacy. Collaboration among governments, financial institutions, and technology providers is essential to ensure secure, reliable, and user-friendly digital payment systems.</w:t>
+        <w:t xml:space="preserve">With continuous advancements in fintech, blockchain, and artificial intelligence, the future of digital transactions looks promising. If implemented effectively, a 100% digitized economy can pave the way for a more sustainable, resilient, and globally connected financial landscape, benefiting individuals, businesses, and governments alike.  </w:t>
       </w:r>
     </w:p>
     <w:p>
@@ -1561,7 +1561,7 @@
         <w:ind w:left="0" w:right="287"/>
       </w:pPr>
       <w:r>
-        <w:t>With continuous advancements in fintech, blockchain, and artificial intelligence, the future of digital transactions looks promising. A 100% digitized economy can pave the way for a more sustainable, resilient, and globally connected financial landscape, benefiting individuals, businesses, and governments alike.</w:t>
+        <w:t xml:space="preserve">Visiting a small shop where digital transactions had just started provided a hands-on learning experience about the real-world implementation of cashless payments. Observing how the shopkeeper adapted to digital payment methods highlighted both the benefits and challenges of transitioning from cash-based transactions. It was insightful to see how digital payments improved efficiency and security while also identifying initial hurdles such as technical difficulties and the need for digital literacy.  </w:t>
       </w:r>
     </w:p>
     <w:p>
@@ -1569,7 +1569,7 @@
         <w:ind w:left="0" w:right="287"/>
       </w:pPr>
       <w:r>
-        <w:t>A hands-on learning experience observed in a small shop where digital transactions had just started provided valuable insights into the real-world implementation of cashless payments. The experience highlighted both the benefits and challenges of transitioning from cash-based transactions, enhancing communication and problem-solving skills.</w:t>
+        <w:t xml:space="preserve">Interacting with the shopkeeper enhanced communication skills, as we explained the advantages of digital transactions and addressed concerns about security and transaction fees. This experience also improved problem-solving abilities by discussing potential solutions to challenges like internet connectivity issues and customer hesitation in using digital payments.  </w:t>
       </w:r>
     </w:p>
     <w:p>
@@ -1652,7 +1652,7 @@
         <w:ind w:left="0" w:right="287"/>
       </w:pPr>
       <w:r>
-        <w:t>The experience in the small shop demonstrated the importance of digital literacy and problem-solving skills in implementing digital payments. It also underscores the need for addressing issues such as technical difficulties and customer hesitation in using digital payments</w:t>
+        <w:t xml:space="preserve">The Figure 5.1 shows a small shop owner learning digital payments and demonstrating how digital transaction works.  </w:t>
       </w:r>
     </w:p>
     <w:p>

</xml_diff>